<commit_message>
feat(walid): add Dartmouth↔Uniacke fuel/travel to siding contract
Include one round-trip crew fuel/travel line ($50.26 at CRA $0.72/km)
in the Walid contract price, payment schedule, Schedule A, DOCX, and
Manus contract summary. Contract total before HST is now $13,050.26.

Co-authored-by: Joel <GemsNS@users.noreply.github.com>
</commit_message>
<xml_diff>
--- a/presentations/walid/clean/project-assets/Walid_Siding_Contract.docx
+++ b/presentations/walid/clean/project-assets/Walid_Siding_Contract.docx
@@ -4,7 +4,7 @@
   <w:body>
     <w:p>
       <w:pPr>
-        <w:pStyle w:val="Heading1"/>
+        <w:pStyle w:val="Title"/>
       </w:pPr>
       <w:r>
         <w:t>Construction Subcontract / Trade Agreement</w:t>
@@ -12,7 +12,7 @@
     </w:p>
     <w:p>
       <w:pPr>
-        <w:pStyle w:val="Heading2"/>
+        <w:pStyle w:val="Heading1"/>
       </w:pPr>
       <w:r>
         <w:t>Exterior Siding, Façade Accents, and Door Installation</w:t>
@@ -45,6 +45,9 @@
           </w:tcPr>
           <w:p>
             <w:r>
+              <w:rPr>
+                <w:b/>
+              </w:rPr>
               <w:t>Party</w:t>
             </w:r>
           </w:p>
@@ -55,6 +58,9 @@
           </w:tcPr>
           <w:p>
             <w:r>
+              <w:rPr>
+                <w:b/>
+              </w:rPr>
               <w:t>Legal and contact information</w:t>
             </w:r>
           </w:p>
@@ -67,7 +73,7 @@
           </w:tcPr>
           <w:p>
             <w:r>
-              <w:t>**Contractor / Trade Contractor**</w:t>
+              <w:t>Contractor / Trade Contractor</w:t>
             </w:r>
           </w:p>
         </w:tc>
@@ -77,7 +83,7 @@
           </w:tcPr>
           <w:p>
             <w:r>
-              <w:t>**BH Contracting Ltd.**; telephone: (902) 809-9412; email: info@bhcontracting.ca; registered address: **____________________________**; HST number: **________________**</w:t>
+              <w:t>BH Contracting Ltd.; telephone: (902) 809-9412; email: info@bhcontracting.ca; registered address: ____________________________; HST number: ________________</w:t>
             </w:r>
           </w:p>
         </w:tc>
@@ -89,7 +95,7 @@
           </w:tcPr>
           <w:p>
             <w:r>
-              <w:t>**Customer / Hiring Party**</w:t>
+              <w:t>Customer / Hiring Party</w:t>
             </w:r>
           </w:p>
         </w:tc>
@@ -99,13 +105,12 @@
           </w:tcPr>
           <w:p>
             <w:r>
-              <w:t>**SOI Trade Inc.**, attention: **Walid Sallam**; address: **____________________________**; telephone: **________________**; email: **________________**</w:t>
+              <w:t>SOI Trade Inc., attention: Walid Sallam; address: ____________________________; telephone: ________________; email: ________________</w:t>
             </w:r>
           </w:p>
         </w:tc>
       </w:tr>
     </w:tbl>
-    <w:p/>
     <w:p>
       <w:r>
         <w:t>BH Contracting Ltd. is referred to as the “Contractor.” SOI Trade Inc. is referred to as the “Customer.” The Contractor and Customer are together the “Parties.”</w:t>
@@ -113,7 +118,7 @@
     </w:p>
     <w:p>
       <w:pPr>
-        <w:pStyle w:val="Heading2"/>
+        <w:pStyle w:val="Heading1"/>
       </w:pPr>
       <w:r>
         <w:t>1. Contract Documents and Order of Priority</w:t>
@@ -141,6 +146,9 @@
           </w:tcPr>
           <w:p>
             <w:r>
+              <w:rPr>
+                <w:b/>
+              </w:rPr>
               <w:t>Priority</w:t>
             </w:r>
           </w:p>
@@ -151,6 +159,9 @@
           </w:tcPr>
           <w:p>
             <w:r>
+              <w:rPr>
+                <w:b/>
+              </w:rPr>
               <w:t>Document</w:t>
             </w:r>
           </w:p>
@@ -267,7 +278,6 @@
         </w:tc>
       </w:tr>
     </w:tbl>
-    <w:p/>
     <w:p>
       <w:r>
         <w:t>If the documents conflict, the Contractor shall stop the affected work and request written direction. The BH Contracting model, renderings, takeoff, and concept elevations are not permit, structural, shop, engineering, or sealed drawings. No direction that changes cost, time, quantity, sequencing, or risk is binding unless recorded in a signed change order.</w:t>
@@ -275,7 +285,7 @@
     </w:p>
     <w:p>
       <w:pPr>
-        <w:pStyle w:val="Heading2"/>
+        <w:pStyle w:val="Heading1"/>
       </w:pPr>
       <w:r>
         <w:t>2. Scope of Work</w:t>
@@ -291,7 +301,7 @@
         <w:pStyle w:val="ListNumber"/>
       </w:pPr>
       <w:r>
-        <w:t>Layout and installation of approximately **30 squares (approximately 3,000 square feet)** of exterior siding/cladding in a charcoal-and-cedar-tone façade pattern approved by the Customer.</w:t>
+        <w:t>1. Layout and installation of approximately 30 squares (approximately 3,000 square feet) of exterior siding/cladding in a charcoal-and-cedar-tone façade pattern approved by the Customer.</w:t>
       </w:r>
     </w:p>
     <w:p>
@@ -299,7 +309,7 @@
         <w:pStyle w:val="ListNumber"/>
       </w:pPr>
       <w:r>
-        <w:t>Installation of associated siding trims, starter components, closures, corner treatments, and opening perimeter trims **only to the extent expressly identified as Contractor-supplied or Customer-supplied in Schedule A**.</w:t>
+        <w:t>2. Installation of associated siding trims, starter components, closures, corner treatments, and opening perimeter trims only to the extent expressly identified as Contractor-supplied or Customer-supplied in Schedule A.</w:t>
       </w:r>
     </w:p>
     <w:p>
@@ -307,7 +317,7 @@
         <w:pStyle w:val="ListNumber"/>
       </w:pPr>
       <w:r>
-        <w:t>Installation of **two exterior doors** at the agreed locations, including setting, plumbing, levelling, shimming, mechanical fastening, and ordinary perimeter air sealing, subject to the supplied-door and rough-opening conditions in Schedule A.</w:t>
+        <w:t>3. Installation of two exterior doors at the agreed locations, including setting, plumbing, levelling, shimming, mechanical fastening, and ordinary perimeter air sealing, subject to the supplied-door and rough-opening conditions in Schedule A.</w:t>
       </w:r>
     </w:p>
     <w:p>
@@ -315,7 +325,7 @@
         <w:pStyle w:val="ListNumber"/>
       </w:pPr>
       <w:r>
-        <w:t>Routine protection of the Contractor’s active work area, daily housekeeping, and removal of the Contractor’s packaging and installation debris to the designated on-site disposal location.</w:t>
+        <w:t>4. Routine protection of the Contractor’s active work area, daily housekeeping, and removal of the Contractor’s packaging and installation debris to the designated on-site disposal location.</w:t>
       </w:r>
     </w:p>
     <w:p>
@@ -323,7 +333,15 @@
         <w:pStyle w:val="ListNumber"/>
       </w:pPr>
       <w:r>
-        <w:t>Coordination with the Customer regarding opening dimensions, sequencing, access, approved layout, and substrate readiness.</w:t>
+        <w:t>5. Coordination with the Customer regarding opening dimensions, sequencing, access, approved layout, and substrate readiness.</w:t>
+      </w:r>
+    </w:p>
+    <w:p>
+      <w:pPr>
+        <w:pStyle w:val="ListNumber"/>
+      </w:pPr>
+      <w:r>
+        <w:t>6. One included round-trip crew fuel/travel allowance between 9A Regency Drive, Dartmouth, NS and the Project site (and back), as priced in Section 3.</w:t>
       </w:r>
     </w:p>
     <w:p>
@@ -333,7 +351,7 @@
     </w:p>
     <w:p>
       <w:pPr>
-        <w:pStyle w:val="Heading2"/>
+        <w:pStyle w:val="Heading1"/>
       </w:pPr>
       <w:r>
         <w:t>3. Contract Price</w:t>
@@ -363,6 +381,9 @@
           </w:tcPr>
           <w:p>
             <w:r>
+              <w:rPr>
+                <w:b/>
+              </w:rPr>
               <w:t>Price component</w:t>
             </w:r>
           </w:p>
@@ -373,6 +394,9 @@
           </w:tcPr>
           <w:p>
             <w:r>
+              <w:rPr>
+                <w:b/>
+              </w:rPr>
               <w:t>Quantity</w:t>
             </w:r>
           </w:p>
@@ -383,6 +407,9 @@
           </w:tcPr>
           <w:p>
             <w:r>
+              <w:rPr>
+                <w:b/>
+              </w:rPr>
               <w:t>Unit price</w:t>
             </w:r>
           </w:p>
@@ -393,6 +420,9 @@
           </w:tcPr>
           <w:p>
             <w:r>
+              <w:rPr>
+                <w:b/>
+              </w:rPr>
               <w:t>Extended price</w:t>
             </w:r>
           </w:p>
@@ -489,7 +519,49 @@
           </w:tcPr>
           <w:p>
             <w:r>
-              <w:t>**Contract price before HST**</w:t>
+              <w:t>Crew fuel/travel (round trip)</w:t>
+            </w:r>
+          </w:p>
+        </w:tc>
+        <w:tc>
+          <w:tcPr>
+            <w:tcW w:type="dxa" w:w="2160"/>
+          </w:tcPr>
+          <w:p>
+            <w:r>
+              <w:t>69.8 km</w:t>
+            </w:r>
+          </w:p>
+        </w:tc>
+        <w:tc>
+          <w:tcPr>
+            <w:tcW w:type="dxa" w:w="2160"/>
+          </w:tcPr>
+          <w:p>
+            <w:r>
+              <w:t>$0.72 per km (CRA rate)</w:t>
+            </w:r>
+          </w:p>
+        </w:tc>
+        <w:tc>
+          <w:tcPr>
+            <w:tcW w:type="dxa" w:w="2160"/>
+          </w:tcPr>
+          <w:p>
+            <w:r>
+              <w:t>$50.26</w:t>
+            </w:r>
+          </w:p>
+        </w:tc>
+      </w:tr>
+      <w:tr>
+        <w:tc>
+          <w:tcPr>
+            <w:tcW w:type="dxa" w:w="2160"/>
+          </w:tcPr>
+          <w:p>
+            <w:r>
+              <w:t>Contract price before HST</w:t>
             </w:r>
           </w:p>
         </w:tc>
@@ -515,7 +587,7 @@
           </w:tcPr>
           <w:p>
             <w:r>
-              <w:t>**$13,000.00**</w:t>
+              <w:t>$13,050.26</w:t>
             </w:r>
           </w:p>
         </w:tc>
@@ -545,7 +617,7 @@
           </w:tcPr>
           <w:p>
             <w:r>
-              <w:t>**Confirm applicable treatment**</w:t>
+              <w:t>Confirm applicable treatment</w:t>
             </w:r>
           </w:p>
         </w:tc>
@@ -555,7 +627,7 @@
           </w:tcPr>
           <w:p>
             <w:r>
-              <w:t>**$________________**</w:t>
+              <w:t>$________________</w:t>
             </w:r>
           </w:p>
         </w:tc>
@@ -567,7 +639,7 @@
           </w:tcPr>
           <w:p>
             <w:r>
-              <w:t>**Total including HST**</w:t>
+              <w:t>Total including HST</w:t>
             </w:r>
           </w:p>
         </w:tc>
@@ -593,21 +665,25 @@
           </w:tcPr>
           <w:p>
             <w:r>
-              <w:t>**$________________**</w:t>
+              <w:t>$________________</w:t>
             </w:r>
           </w:p>
         </w:tc>
       </w:tr>
     </w:tbl>
-    <w:p/>
     <w:p>
       <w:r>
-        <w:t>The $13,000.00 price and its tax treatment must be confirmed by both Parties before signature. The price is based on approximately 30 squares and two doors. Unless Schedule A expressly states otherwise, quantities materially above 30 squares, added doors/openings, redesign, concealed conditions, substrate correction, remobilization, winter conditions, extraordinary access, and work outside normal installation scope are changes to the contract.</w:t>
+        <w:t>The crew fuel/travel line covers one round trip between 9A Regency Drive, Dartmouth, NS and the Project at 9 Alicia Scott Ave., Mount Uniacke, NS (and back), priced at the CRA reasonable automobile rate of $0.72/km for 69.8 km. Additional trips, if required, shall be billed by written change order at the same rate unless the Parties agree otherwise.</w:t>
+      </w:r>
+    </w:p>
+    <w:p>
+      <w:r>
+        <w:t>The $13,050.26 price and its tax treatment must be confirmed by both Parties before signature. The price is based on approximately 30 squares, two doors, and the included fuel/travel allowance above. Unless Schedule A expressly states otherwise, quantities materially above 30 squares, added doors/openings, redesign, concealed conditions, substrate correction, remobilization beyond the included trip, winter conditions, extraordinary access, and work outside normal installation scope are changes to the contract.</w:t>
       </w:r>
     </w:p>
     <w:p>
       <w:pPr>
-        <w:pStyle w:val="Heading2"/>
+        <w:pStyle w:val="Heading1"/>
       </w:pPr>
       <w:r>
         <w:t>4. Measurement and Quantity Adjustment</w:t>
@@ -625,7 +701,7 @@
     </w:p>
     <w:p>
       <w:pPr>
-        <w:pStyle w:val="Heading2"/>
+        <w:pStyle w:val="Heading1"/>
       </w:pPr>
       <w:r>
         <w:t>5. Payment Terms and Statutory Holdback</w:t>
@@ -633,7 +709,7 @@
     </w:p>
     <w:p>
       <w:r>
-        <w:t>The Customer shall pay approved invoices according to the following gross progress schedule. Each progress payment is subject to any statutory holdback required by the Nova Scotia *Builders’ Lien Act*.</w:t>
+        <w:t>The Customer shall pay approved invoices according to the following gross progress schedule. Each progress payment is subject to any statutory holdback required by the Nova Scotia Builders’ Lien Act.</w:t>
       </w:r>
     </w:p>
     <w:tbl>
@@ -653,6 +729,9 @@
           </w:tcPr>
           <w:p>
             <w:r>
+              <w:rPr>
+                <w:b/>
+              </w:rPr>
               <w:t>Milestone</w:t>
             </w:r>
           </w:p>
@@ -663,6 +742,9 @@
           </w:tcPr>
           <w:p>
             <w:r>
+              <w:rPr>
+                <w:b/>
+              </w:rPr>
               <w:t>Gross amount before holdback and HST</w:t>
             </w:r>
           </w:p>
@@ -675,7 +757,7 @@
           </w:tcPr>
           <w:p>
             <w:r>
-              <w:t>Mobilization, approved layout, and commencement of installation</w:t>
+              <w:t>Mobilization, approved layout, commencement, and included fuel/travel</w:t>
             </w:r>
           </w:p>
         </w:tc>
@@ -685,7 +767,7 @@
           </w:tcPr>
           <w:p>
             <w:r>
-              <w:t>$3,250.00</w:t>
+              <w:t>$3,300.26</w:t>
             </w:r>
           </w:p>
         </w:tc>
@@ -741,7 +823,7 @@
           </w:tcPr>
           <w:p>
             <w:r>
-              <w:t>**Total contract price before HST**</w:t>
+              <w:t>Total contract price before HST</w:t>
             </w:r>
           </w:p>
         </w:tc>
@@ -751,16 +833,15 @@
           </w:tcPr>
           <w:p>
             <w:r>
-              <w:t>**$13,000.00**</w:t>
+              <w:t>$13,050.26</w:t>
             </w:r>
           </w:p>
         </w:tc>
       </w:tr>
     </w:tbl>
-    <w:p/>
     <w:p>
       <w:r>
-        <w:t>The payer shall retain 10% of the value of work, services, and materials actually supplied for the statutory period. Under section 13 of the Nova Scotia *Builders’ Lien Act*, the holdback is generally retained for 60 days after substantial performance, subject to the Act’s conditions, lien notices, remaining work, and release rules.[1] On the $13,000.00 pre-HST price, the full contract holdback would be $1,300.00 if the entire price is lienable and no adjustment applies.</w:t>
+        <w:t>The payer shall retain 10% of the value of work, services, and materials actually supplied for the statutory period. Under section 13 of the Nova Scotia Builders’ Lien Act, the holdback is generally retained for 60 days after substantial performance, subject to the Act’s conditions, lien notices, remaining work, and release rules.[1] On the $13,050.26 pre-HST price, the full contract holdback would be $1,305.03 if the entire price is lienable and no adjustment applies.</w:t>
       </w:r>
     </w:p>
     <w:p>
@@ -770,7 +851,7 @@
     </w:p>
     <w:p>
       <w:pPr>
-        <w:pStyle w:val="Heading2"/>
+        <w:pStyle w:val="Heading1"/>
       </w:pPr>
       <w:r>
         <w:t>6. Schedule</w:t>
@@ -788,7 +869,7 @@
     </w:p>
     <w:p>
       <w:pPr>
-        <w:pStyle w:val="Heading2"/>
+        <w:pStyle w:val="Heading1"/>
       </w:pPr>
       <w:r>
         <w:t>7. Customer Responsibilities</w:t>
@@ -804,7 +885,7 @@
         <w:pStyle w:val="ListNumber"/>
       </w:pPr>
       <w:r>
-        <w:t>Provide lawful and safe access to the Project, work faces, washroom facilities, electrical power, water where reasonably required, and a designated area for material staging and waste.</w:t>
+        <w:t>1. Provide lawful and safe access to the Project, work faces, washroom facilities, electrical power, water where reasonably required, and a designated area for material staging and waste.</w:t>
       </w:r>
     </w:p>
     <w:p>
@@ -812,7 +893,7 @@
         <w:pStyle w:val="ListNumber"/>
       </w:pPr>
       <w:r>
-        <w:t>Provide the latest authorized drawings, permits, approvals, surveys, shop drawings, product data, finish selections, and written coordination information affecting the Contractor’s work.</w:t>
+        <w:t>2. Provide the latest authorized drawings, permits, approvals, surveys, shop drawings, product data, finish selections, and written coordination information affecting the Contractor’s work.</w:t>
       </w:r>
     </w:p>
     <w:p>
@@ -820,7 +901,7 @@
         <w:pStyle w:val="ListNumber"/>
       </w:pPr>
       <w:r>
-        <w:t>Ensure the wall substrate, sheathing, air/water barrier, membranes, insulation, furring, blocking, flashings, roof/eave transitions, penetrations, and rough openings are complete, sound, dry, plumb, level, properly integrated, and ready to receive the Contractor’s work, except for items expressly included in Schedule A.</w:t>
+        <w:t>3. Ensure the wall substrate, sheathing, air/water barrier, membranes, insulation, furring, blocking, flashings, roof/eave transitions, penetrations, and rough openings are complete, sound, dry, plumb, level, properly integrated, and ready to receive the Contractor’s work, except for items expressly included in Schedule A.</w:t>
       </w:r>
     </w:p>
     <w:p>
@@ -828,7 +909,7 @@
         <w:pStyle w:val="ListNumber"/>
       </w:pPr>
       <w:r>
-        <w:t>Confirm the legal identity of the owner, constructor/general contractor, Customer, consultant, and party authorized to direct and approve changes.</w:t>
+        <w:t>4. Confirm the legal identity of the owner, constructor/general contractor, Customer, consultant, and party authorized to direct and approve changes.</w:t>
       </w:r>
     </w:p>
     <w:p>
@@ -836,7 +917,7 @@
         <w:pStyle w:val="ListNumber"/>
       </w:pPr>
       <w:r>
-        <w:t>Arrange uninterrupted access to the work and coordinate other trades so they do not damage, cover, remove, or obstruct the Contractor’s work.</w:t>
+        <w:t>5. Arrange uninterrupted access to the work and coordinate other trades so they do not damage, cover, remove, or obstruct the Contractor’s work.</w:t>
       </w:r>
     </w:p>
     <w:p>
@@ -844,7 +925,7 @@
         <w:pStyle w:val="ListNumber"/>
       </w:pPr>
       <w:r>
-        <w:t>Verify that Customer-supplied materials are correct, undamaged, compatible, code-compliant, complete, delivered on time, and sufficient for the work, including reasonable waste and replacements.</w:t>
+        <w:t>6. Verify that Customer-supplied materials are correct, undamaged, compatible, code-compliant, complete, delivered on time, and sufficient for the work, including reasonable waste and replacements.</w:t>
       </w:r>
     </w:p>
     <w:p>
@@ -852,12 +933,12 @@
         <w:pStyle w:val="ListNumber"/>
       </w:pPr>
       <w:r>
-        <w:t>Provide written approval of the façade layout, material colours, transition heights, trim approach, and door locations before installation.</w:t>
+        <w:t>7. Provide written approval of the façade layout, material colours, transition heights, trim approach, and door locations before installation.</w:t>
       </w:r>
     </w:p>
     <w:p>
       <w:pPr>
-        <w:pStyle w:val="Heading2"/>
+        <w:pStyle w:val="Heading1"/>
       </w:pPr>
       <w:r>
         <w:t>8. Contractor Responsibilities</w:t>
@@ -873,7 +954,7 @@
         <w:pStyle w:val="ListNumber"/>
       </w:pPr>
       <w:r>
-        <w:t>Supervise and coordinate its own personnel and subcontractors.</w:t>
+        <w:t>1. Supervise and coordinate its own personnel and subcontractors.</w:t>
       </w:r>
     </w:p>
     <w:p>
@@ -881,7 +962,7 @@
         <w:pStyle w:val="ListNumber"/>
       </w:pPr>
       <w:r>
-        <w:t>Follow applicable occupational-health-and-safety requirements and take every precaution reasonably required within the Contractor’s authority and control. Nova Scotia’s framework assigns duties to owners, constructors, contractors, employers, and workers according to their roles and degree of control; this agreement does not transfer a statutory duty contrary to law.[2]</w:t>
+        <w:t>2. Follow applicable occupational-health-and-safety requirements and take every precaution reasonably required within the Contractor’s authority and control. Nova Scotia’s framework assigns duties to owners, constructors, contractors, employers, and workers according to their roles and degree of control; this agreement does not transfer a statutory duty contrary to law.[2]</w:t>
       </w:r>
     </w:p>
     <w:p>
@@ -889,7 +970,7 @@
         <w:pStyle w:val="ListNumber"/>
       </w:pPr>
       <w:r>
-        <w:t>Promptly report discovered conditions that materially conflict with the contract documents, safe installation, or manufacturer requirements.</w:t>
+        <w:t>3. Promptly report discovered conditions that materially conflict with the contract documents, safe installation, or manufacturer requirements.</w:t>
       </w:r>
     </w:p>
     <w:p>
@@ -897,7 +978,7 @@
         <w:pStyle w:val="ListNumber"/>
       </w:pPr>
       <w:r>
-        <w:t>Protect its work until the Customer takes possession or another trade assumes control of the affected area, whichever occurs first.</w:t>
+        <w:t>4. Protect its work until the Customer takes possession or another trade assumes control of the affected area, whichever occurs first.</w:t>
       </w:r>
     </w:p>
     <w:p>
@@ -905,12 +986,12 @@
         <w:pStyle w:val="ListNumber"/>
       </w:pPr>
       <w:r>
-        <w:t>Maintain records reasonably supporting progress invoices, approved extras, and substantial performance.</w:t>
+        <w:t>5. Maintain records reasonably supporting progress invoices, approved extras, and substantial performance.</w:t>
       </w:r>
     </w:p>
     <w:p>
       <w:pPr>
-        <w:pStyle w:val="Heading2"/>
+        <w:pStyle w:val="Heading1"/>
       </w:pPr>
       <w:r>
         <w:t>9. WCB, Insurance, and Compliance</w:t>
@@ -928,7 +1009,7 @@
     </w:p>
     <w:p>
       <w:pPr>
-        <w:pStyle w:val="Heading2"/>
+        <w:pStyle w:val="Heading1"/>
       </w:pPr>
       <w:r>
         <w:t>10. Changes and Extra Work</w:t>
@@ -946,7 +1027,7 @@
     </w:p>
     <w:p>
       <w:pPr>
-        <w:pStyle w:val="Heading2"/>
+        <w:pStyle w:val="Heading1"/>
       </w:pPr>
       <w:r>
         <w:t>11. Site Conditions and Substrate</w:t>
@@ -964,7 +1045,7 @@
     </w:p>
     <w:p>
       <w:pPr>
-        <w:pStyle w:val="Heading2"/>
+        <w:pStyle w:val="Heading1"/>
       </w:pPr>
       <w:r>
         <w:t>12. Materials, Title, and Risk</w:t>
@@ -982,7 +1063,7 @@
     </w:p>
     <w:p>
       <w:pPr>
-        <w:pStyle w:val="Heading2"/>
+        <w:pStyle w:val="Heading1"/>
       </w:pPr>
       <w:r>
         <w:t>13. Inspection, Deficiencies, and Substantial Performance</w:t>
@@ -1000,7 +1081,7 @@
     </w:p>
     <w:p>
       <w:pPr>
-        <w:pStyle w:val="Heading2"/>
+        <w:pStyle w:val="Heading1"/>
       </w:pPr>
       <w:r>
         <w:t>14. Workmanship Warranty</w:t>
@@ -1018,7 +1099,7 @@
     </w:p>
     <w:p>
       <w:pPr>
-        <w:pStyle w:val="Heading2"/>
+        <w:pStyle w:val="Heading1"/>
       </w:pPr>
       <w:r>
         <w:t>15. Suspension and Termination</w:t>
@@ -1036,7 +1117,7 @@
     </w:p>
     <w:p>
       <w:pPr>
-        <w:pStyle w:val="Heading2"/>
+        <w:pStyle w:val="Heading1"/>
       </w:pPr>
       <w:r>
         <w:t>16. Indemnity and Limitation</w:t>
@@ -1054,7 +1135,7 @@
     </w:p>
     <w:p>
       <w:pPr>
-        <w:pStyle w:val="Heading2"/>
+        <w:pStyle w:val="Heading1"/>
       </w:pPr>
       <w:r>
         <w:t>17. Dispute Resolution</w:t>
@@ -1072,7 +1153,7 @@
     </w:p>
     <w:p>
       <w:pPr>
-        <w:pStyle w:val="Heading2"/>
+        <w:pStyle w:val="Heading1"/>
       </w:pPr>
       <w:r>
         <w:t>18. Notices</w:t>
@@ -1085,7 +1166,7 @@
     </w:p>
     <w:p>
       <w:pPr>
-        <w:pStyle w:val="Heading2"/>
+        <w:pStyle w:val="Heading1"/>
       </w:pPr>
       <w:r>
         <w:t>19. General Terms</w:t>
@@ -1103,7 +1184,7 @@
     </w:p>
     <w:p>
       <w:pPr>
-        <w:pStyle w:val="Heading2"/>
+        <w:pStyle w:val="Heading1"/>
       </w:pPr>
       <w:r>
         <w:t>20. Signatures</w:t>
@@ -1131,6 +1212,9 @@
           </w:tcPr>
           <w:p>
             <w:r>
+              <w:rPr>
+                <w:b/>
+              </w:rPr>
               <w:t>For BH Contracting Ltd.</w:t>
             </w:r>
           </w:p>
@@ -1141,6 +1225,9 @@
           </w:tcPr>
           <w:p>
             <w:r>
+              <w:rPr>
+                <w:b/>
+              </w:rPr>
               <w:t>For SOI Trade Inc.</w:t>
             </w:r>
           </w:p>
@@ -1153,7 +1240,7 @@
           </w:tcPr>
           <w:p>
             <w:r>
-              <w:t>Name: **____________________________**</w:t>
+              <w:t>Name: ____________________________</w:t>
             </w:r>
           </w:p>
         </w:tc>
@@ -1163,7 +1250,7 @@
           </w:tcPr>
           <w:p>
             <w:r>
-              <w:t>Name: **Walid Sallam / ____________________________**</w:t>
+              <w:t>Name: Walid Sallam / ____________________________</w:t>
             </w:r>
           </w:p>
         </w:tc>
@@ -1175,7 +1262,7 @@
           </w:tcPr>
           <w:p>
             <w:r>
-              <w:t>Title: **____________________________**</w:t>
+              <w:t>Title: ____________________________</w:t>
             </w:r>
           </w:p>
         </w:tc>
@@ -1185,7 +1272,7 @@
           </w:tcPr>
           <w:p>
             <w:r>
-              <w:t>Title: **____________________________**</w:t>
+              <w:t>Title: ____________________________</w:t>
             </w:r>
           </w:p>
         </w:tc>
@@ -1197,7 +1284,7 @@
           </w:tcPr>
           <w:p>
             <w:r>
-              <w:t>Signature: **_________________________**</w:t>
+              <w:t>Signature: _________________________</w:t>
             </w:r>
           </w:p>
         </w:tc>
@@ -1207,7 +1294,7 @@
           </w:tcPr>
           <w:p>
             <w:r>
-              <w:t>Signature: **_________________________**</w:t>
+              <w:t>Signature: _________________________</w:t>
             </w:r>
           </w:p>
         </w:tc>
@@ -1219,7 +1306,7 @@
           </w:tcPr>
           <w:p>
             <w:r>
-              <w:t>Date: **_____________________________**</w:t>
+              <w:t>Date: _____________________________</w:t>
             </w:r>
           </w:p>
         </w:tc>
@@ -1229,16 +1316,15 @@
           </w:tcPr>
           <w:p>
             <w:r>
-              <w:t>Date: **_____________________________**</w:t>
+              <w:t>Date: _____________________________</w:t>
             </w:r>
           </w:p>
         </w:tc>
       </w:tr>
     </w:tbl>
-    <w:p/>
     <w:p>
       <w:pPr>
-        <w:pStyle w:val="Heading1"/>
+        <w:pStyle w:val="Title"/>
       </w:pPr>
       <w:r>
         <w:t>Schedule A — Detailed Scope and Responsibility Matrix</w:t>
@@ -1269,6 +1355,9 @@
           </w:tcPr>
           <w:p>
             <w:r>
+              <w:rPr>
+                <w:b/>
+              </w:rPr>
               <w:t>Item</w:t>
             </w:r>
           </w:p>
@@ -1279,6 +1368,9 @@
           </w:tcPr>
           <w:p>
             <w:r>
+              <w:rPr>
+                <w:b/>
+              </w:rPr>
               <w:t>Included by BH</w:t>
             </w:r>
           </w:p>
@@ -1289,6 +1381,9 @@
           </w:tcPr>
           <w:p>
             <w:r>
+              <w:rPr>
+                <w:b/>
+              </w:rPr>
               <w:t>Customer-supplied / by others</w:t>
             </w:r>
           </w:p>
@@ -1299,6 +1394,9 @@
           </w:tcPr>
           <w:p>
             <w:r>
+              <w:rPr>
+                <w:b/>
+              </w:rPr>
               <w:t>Excluded</w:t>
             </w:r>
           </w:p>
@@ -1309,6 +1407,9 @@
           </w:tcPr>
           <w:p>
             <w:r>
+              <w:rPr>
+                <w:b/>
+              </w:rPr>
               <w:t>Clarification</w:t>
             </w:r>
           </w:p>
@@ -2075,6 +2176,58 @@
           </w:tcPr>
           <w:p>
             <w:r>
+              <w:t>Crew vehicle fuel/travel (Dartmouth ↔ site RT)</w:t>
+            </w:r>
+          </w:p>
+        </w:tc>
+        <w:tc>
+          <w:tcPr>
+            <w:tcW w:type="dxa" w:w="1728"/>
+          </w:tcPr>
+          <w:p>
+            <w:r>
+              <w:t>☒</w:t>
+            </w:r>
+          </w:p>
+        </w:tc>
+        <w:tc>
+          <w:tcPr>
+            <w:tcW w:type="dxa" w:w="1728"/>
+          </w:tcPr>
+          <w:p>
+            <w:r>
+              <w:t>☐</w:t>
+            </w:r>
+          </w:p>
+        </w:tc>
+        <w:tc>
+          <w:tcPr>
+            <w:tcW w:type="dxa" w:w="1728"/>
+          </w:tcPr>
+          <w:p>
+            <w:r>
+              <w:t>☐</w:t>
+            </w:r>
+          </w:p>
+        </w:tc>
+        <w:tc>
+          <w:tcPr>
+            <w:tcW w:type="dxa" w:w="1728"/>
+          </w:tcPr>
+          <w:p>
+            <w:r>
+              <w:t>$50.26 included; 9A Regency Drive ↔ Mount Uniacke @ $0.72/km</w:t>
+            </w:r>
+          </w:p>
+        </w:tc>
+      </w:tr>
+      <w:tr>
+        <w:tc>
+          <w:tcPr>
+            <w:tcW w:type="dxa" w:w="1728"/>
+          </w:tcPr>
+          <w:p>
+            <w:r>
               <w:t>Fall-protection anchor provisions</w:t>
             </w:r>
           </w:p>
@@ -2477,10 +2630,9 @@
         </w:tc>
       </w:tr>
     </w:tbl>
-    <w:p/>
     <w:p>
       <w:pPr>
-        <w:pStyle w:val="Heading3"/>
+        <w:pStyle w:val="Heading2"/>
       </w:pPr>
       <w:r>
         <w:t>Approved Façade Layout</w:t>
@@ -2503,6 +2655,9 @@
           </w:tcPr>
           <w:p>
             <w:r>
+              <w:rPr>
+                <w:b/>
+              </w:rPr>
               <w:t>Decision</w:t>
             </w:r>
           </w:p>
@@ -2513,6 +2668,9 @@
           </w:tcPr>
           <w:p>
             <w:r>
+              <w:rPr>
+                <w:b/>
+              </w:rPr>
               <w:t>Approved selection</w:t>
             </w:r>
           </w:p>
@@ -2695,10 +2853,9 @@
         </w:tc>
       </w:tr>
     </w:tbl>
-    <w:p/>
     <w:p>
       <w:pPr>
-        <w:pStyle w:val="Heading1"/>
+        <w:pStyle w:val="Title"/>
       </w:pPr>
       <w:r>
         <w:t>Schedule B — Project Administration</w:t>
@@ -2721,6 +2878,9 @@
           </w:tcPr>
           <w:p>
             <w:r>
+              <w:rPr>
+                <w:b/>
+              </w:rPr>
               <w:t>Item</w:t>
             </w:r>
           </w:p>
@@ -2731,6 +2891,9 @@
           </w:tcPr>
           <w:p>
             <w:r>
+              <w:rPr>
+                <w:b/>
+              </w:rPr>
               <w:t>Agreed information</w:t>
             </w:r>
           </w:p>
@@ -3067,10 +3230,9 @@
         </w:tc>
       </w:tr>
     </w:tbl>
-    <w:p/>
     <w:p>
       <w:pPr>
-        <w:pStyle w:val="Heading1"/>
+        <w:pStyle w:val="Title"/>
       </w:pPr>
       <w:r>
         <w:t>References</w:t>

</xml_diff>

<commit_message>
feat(walid): siding application concepts + 3+1 week fuel scale
Add Cedar Datum / Full Battens / Split Storey / Framed Bays boards on the
locked permit geometry (openings and slope unchanged). Scale crew travel to
20 round trips for a 3-week job plus 1-week pushback ($1,005.12; contract
$14,005.12).

Co-authored-by: Joel <GemsNS@users.noreply.github.com>
</commit_message>
<xml_diff>
--- a/presentations/walid/clean/project-assets/Walid_Siding_Contract.docx
+++ b/presentations/walid/clean/project-assets/Walid_Siding_Contract.docx
@@ -341,7 +341,7 @@
         <w:pStyle w:val="ListNumber"/>
       </w:pPr>
       <w:r>
-        <w:t>6. One included round-trip crew fuel/travel allowance between 9A Regency Drive, Dartmouth, NS and the Project site (and back), as priced in Section 3.</w:t>
+        <w:t>6. Crew fuel/travel allowance for a projected 3-week installation plus 1-week schedule pushback (20 included round trips) between 9A Regency Drive, Dartmouth, NS and the Project site (and back), as priced in Section 3.</w:t>
       </w:r>
     </w:p>
     <w:p>
@@ -519,7 +519,7 @@
           </w:tcPr>
           <w:p>
             <w:r>
-              <w:t>Crew fuel/travel (round trip)</w:t>
+              <w:t>Crew fuel/travel (20 round trips; 3+1 weeks)</w:t>
             </w:r>
           </w:p>
         </w:tc>
@@ -529,7 +529,7 @@
           </w:tcPr>
           <w:p>
             <w:r>
-              <w:t>69.8 km</w:t>
+              <w:t>1,396.0 km</w:t>
             </w:r>
           </w:p>
         </w:tc>
@@ -549,7 +549,7 @@
           </w:tcPr>
           <w:p>
             <w:r>
-              <w:t>$50.26</w:t>
+              <w:t>$1,005.12</w:t>
             </w:r>
           </w:p>
         </w:tc>
@@ -587,7 +587,7 @@
           </w:tcPr>
           <w:p>
             <w:r>
-              <w:t>$13,050.26</w:t>
+              <w:t>$14,005.12</w:t>
             </w:r>
           </w:p>
         </w:tc>
@@ -673,12 +673,12 @@
     </w:tbl>
     <w:p>
       <w:r>
-        <w:t>The crew fuel/travel line covers one round trip between 9A Regency Drive, Dartmouth, NS and the Project at 9 Alicia Scott Ave., Mount Uniacke, NS (and back), priced at the CRA reasonable automobile rate of $0.72/km for 69.8 km. Additional trips, if required, shall be billed by written change order at the same rate unless the Parties agree otherwise.</w:t>
+        <w:t>The crew fuel/travel line covers daily crew commuting for a projected 3-week job plus 1-week pushback (20 workdays × 1,396.0 km round trip = 1,396.0 km) between 9A Regency Drive, Dartmouth, NS and the Project at 9 Alicia Scott Ave., Mount Uniacke, NS (and back), priced at the CRA reasonable automobile rate of $0.72/km totaling 1,396.0 km. Trips beyond the included 20 round trips, if required, shall be billed by written change order at the same rate unless the Parties agree otherwise.</w:t>
       </w:r>
     </w:p>
     <w:p>
       <w:r>
-        <w:t>The $13,050.26 price and its tax treatment must be confirmed by both Parties before signature. The price is based on approximately 30 squares, two doors, and the included fuel/travel allowance above. Unless Schedule A expressly states otherwise, quantities materially above 30 squares, added doors/openings, redesign, concealed conditions, substrate correction, remobilization beyond the included trip, winter conditions, extraordinary access, and work outside normal installation scope are changes to the contract.</w:t>
+        <w:t>The $14,005.12 price and its tax treatment must be confirmed by both Parties before signature. The price is based on approximately 30 squares, two doors, and the included fuel/travel allowance above. Unless Schedule A expressly states otherwise, quantities materially above 30 squares, added doors/openings, redesign, concealed conditions, substrate correction, remobilization beyond the included 20 trips, winter conditions, extraordinary access, and work outside normal installation scope are changes to the contract.</w:t>
       </w:r>
     </w:p>
     <w:p>
@@ -767,7 +767,7 @@
           </w:tcPr>
           <w:p>
             <w:r>
-              <w:t>$3,300.26</w:t>
+              <w:t>$4,255.12</w:t>
             </w:r>
           </w:p>
         </w:tc>
@@ -833,7 +833,7 @@
           </w:tcPr>
           <w:p>
             <w:r>
-              <w:t>$13,050.26</w:t>
+              <w:t>$14,005.12</w:t>
             </w:r>
           </w:p>
         </w:tc>
@@ -841,7 +841,7 @@
     </w:tbl>
     <w:p>
       <w:r>
-        <w:t>The payer shall retain 10% of the value of work, services, and materials actually supplied for the statutory period. Under section 13 of the Nova Scotia Builders’ Lien Act, the holdback is generally retained for 60 days after substantial performance, subject to the Act’s conditions, lien notices, remaining work, and release rules.[1] On the $13,050.26 pre-HST price, the full contract holdback would be $1,305.03 if the entire price is lienable and no adjustment applies.</w:t>
+        <w:t>The payer shall retain 10% of the value of work, services, and materials actually supplied for the statutory period. Under section 13 of the Nova Scotia Builders’ Lien Act, the holdback is generally retained for 60 days after substantial performance, subject to the Act’s conditions, lien notices, remaining work, and release rules.[1] On the $14,005.12 pre-HST price, the full contract holdback would be $1,400.51 if the entire price is lienable and no adjustment applies.</w:t>
       </w:r>
     </w:p>
     <w:p>
@@ -2216,7 +2216,7 @@
           </w:tcPr>
           <w:p>
             <w:r>
-              <w:t>$50.26 included; 9A Regency Drive ↔ Mount Uniacke @ $0.72/km</w:t>
+              <w:t>$1,005.12 included; 9A Regency Drive ↔ Mount Uniacke @ $0.72/km</w:t>
             </w:r>
           </w:p>
         </w:tc>

</xml_diff>

<commit_message>
revert(walid): restore PR #22 package; hold for Manus concepts
Revert post-PR22 generated siding boards and fuel rescaling. Keep the
official geometry restore and original finish concepts until Manus
delivers updated application concepts.

Co-authored-by: Joel <GemsNS@users.noreply.github.com>
</commit_message>
<xml_diff>
--- a/presentations/walid/clean/project-assets/Walid_Siding_Contract.docx
+++ b/presentations/walid/clean/project-assets/Walid_Siding_Contract.docx
@@ -341,7 +341,7 @@
         <w:pStyle w:val="ListNumber"/>
       </w:pPr>
       <w:r>
-        <w:t>6. Crew fuel/travel allowance for a projected 3-week installation plus 1-week schedule pushback (20 included round trips) between 9A Regency Drive, Dartmouth, NS and the Project site (and back), as priced in Section 3.</w:t>
+        <w:t>6. One included round-trip crew fuel/travel allowance between 9A Regency Drive, Dartmouth, NS and the Project site (and back), as priced in Section 3.</w:t>
       </w:r>
     </w:p>
     <w:p>
@@ -519,7 +519,7 @@
           </w:tcPr>
           <w:p>
             <w:r>
-              <w:t>Crew fuel/travel (20 round trips; 3+1 weeks)</w:t>
+              <w:t>Crew fuel/travel (round trip)</w:t>
             </w:r>
           </w:p>
         </w:tc>
@@ -529,7 +529,7 @@
           </w:tcPr>
           <w:p>
             <w:r>
-              <w:t>1,396.0 km</w:t>
+              <w:t>69.8 km</w:t>
             </w:r>
           </w:p>
         </w:tc>
@@ -549,7 +549,7 @@
           </w:tcPr>
           <w:p>
             <w:r>
-              <w:t>$1,005.12</w:t>
+              <w:t>$50.26</w:t>
             </w:r>
           </w:p>
         </w:tc>
@@ -587,7 +587,7 @@
           </w:tcPr>
           <w:p>
             <w:r>
-              <w:t>$14,005.12</w:t>
+              <w:t>$13,050.26</w:t>
             </w:r>
           </w:p>
         </w:tc>
@@ -673,12 +673,12 @@
     </w:tbl>
     <w:p>
       <w:r>
-        <w:t>The crew fuel/travel line covers daily crew commuting for a projected 3-week job plus 1-week pushback (20 workdays × 1,396.0 km round trip = 1,396.0 km) between 9A Regency Drive, Dartmouth, NS and the Project at 9 Alicia Scott Ave., Mount Uniacke, NS (and back), priced at the CRA reasonable automobile rate of $0.72/km totaling 1,396.0 km. Trips beyond the included 20 round trips, if required, shall be billed by written change order at the same rate unless the Parties agree otherwise.</w:t>
+        <w:t>The crew fuel/travel line covers one round trip between 9A Regency Drive, Dartmouth, NS and the Project at 9 Alicia Scott Ave., Mount Uniacke, NS (and back), priced at the CRA reasonable automobile rate of $0.72/km for 69.8 km. Additional trips, if required, shall be billed by written change order at the same rate unless the Parties agree otherwise.</w:t>
       </w:r>
     </w:p>
     <w:p>
       <w:r>
-        <w:t>The $14,005.12 price and its tax treatment must be confirmed by both Parties before signature. The price is based on approximately 30 squares, two doors, and the included fuel/travel allowance above. Unless Schedule A expressly states otherwise, quantities materially above 30 squares, added doors/openings, redesign, concealed conditions, substrate correction, remobilization beyond the included 20 trips, winter conditions, extraordinary access, and work outside normal installation scope are changes to the contract.</w:t>
+        <w:t>The $13,050.26 price and its tax treatment must be confirmed by both Parties before signature. The price is based on approximately 30 squares, two doors, and the included fuel/travel allowance above. Unless Schedule A expressly states otherwise, quantities materially above 30 squares, added doors/openings, redesign, concealed conditions, substrate correction, remobilization beyond the included trip, winter conditions, extraordinary access, and work outside normal installation scope are changes to the contract.</w:t>
       </w:r>
     </w:p>
     <w:p>
@@ -767,7 +767,7 @@
           </w:tcPr>
           <w:p>
             <w:r>
-              <w:t>$4,255.12</w:t>
+              <w:t>$3,300.26</w:t>
             </w:r>
           </w:p>
         </w:tc>
@@ -833,7 +833,7 @@
           </w:tcPr>
           <w:p>
             <w:r>
-              <w:t>$14,005.12</w:t>
+              <w:t>$13,050.26</w:t>
             </w:r>
           </w:p>
         </w:tc>
@@ -841,7 +841,7 @@
     </w:tbl>
     <w:p>
       <w:r>
-        <w:t>The payer shall retain 10% of the value of work, services, and materials actually supplied for the statutory period. Under section 13 of the Nova Scotia Builders’ Lien Act, the holdback is generally retained for 60 days after substantial performance, subject to the Act’s conditions, lien notices, remaining work, and release rules.[1] On the $14,005.12 pre-HST price, the full contract holdback would be $1,400.51 if the entire price is lienable and no adjustment applies.</w:t>
+        <w:t>The payer shall retain 10% of the value of work, services, and materials actually supplied for the statutory period. Under section 13 of the Nova Scotia Builders’ Lien Act, the holdback is generally retained for 60 days after substantial performance, subject to the Act’s conditions, lien notices, remaining work, and release rules.[1] On the $13,050.26 pre-HST price, the full contract holdback would be $1,305.03 if the entire price is lienable and no adjustment applies.</w:t>
       </w:r>
     </w:p>
     <w:p>
@@ -2216,7 +2216,7 @@
           </w:tcPr>
           <w:p>
             <w:r>
-              <w:t>$1,005.12 included; 9A Regency Drive ↔ Mount Uniacke @ $0.72/km</w:t>
+              <w:t>$50.26 included; 9A Regency Drive ↔ Mount Uniacke @ $0.72/km</w:t>
             </w:r>
           </w:p>
         </w:tc>

</xml_diff>

<commit_message>
revert: restore repository tree to 116ea2b (PR #20)
Roll back Walid redesign/fuel/embed/concept changes after that push so
main matches Merge PR #20 exactly.

Co-authored-by: Joel <GemsNS@users.noreply.github.com>
</commit_message>
<xml_diff>
--- a/presentations/walid/clean/project-assets/Walid_Siding_Contract.docx
+++ b/presentations/walid/clean/project-assets/Walid_Siding_Contract.docx
@@ -4,7 +4,7 @@
   <w:body>
     <w:p>
       <w:pPr>
-        <w:pStyle w:val="Title"/>
+        <w:pStyle w:val="Heading1"/>
       </w:pPr>
       <w:r>
         <w:t>Construction Subcontract / Trade Agreement</w:t>
@@ -12,7 +12,7 @@
     </w:p>
     <w:p>
       <w:pPr>
-        <w:pStyle w:val="Heading1"/>
+        <w:pStyle w:val="Heading2"/>
       </w:pPr>
       <w:r>
         <w:t>Exterior Siding, Façade Accents, and Door Installation</w:t>
@@ -45,9 +45,6 @@
           </w:tcPr>
           <w:p>
             <w:r>
-              <w:rPr>
-                <w:b/>
-              </w:rPr>
               <w:t>Party</w:t>
             </w:r>
           </w:p>
@@ -58,9 +55,6 @@
           </w:tcPr>
           <w:p>
             <w:r>
-              <w:rPr>
-                <w:b/>
-              </w:rPr>
               <w:t>Legal and contact information</w:t>
             </w:r>
           </w:p>
@@ -73,7 +67,7 @@
           </w:tcPr>
           <w:p>
             <w:r>
-              <w:t>Contractor / Trade Contractor</w:t>
+              <w:t>**Contractor / Trade Contractor**</w:t>
             </w:r>
           </w:p>
         </w:tc>
@@ -83,7 +77,7 @@
           </w:tcPr>
           <w:p>
             <w:r>
-              <w:t>BH Contracting Ltd.; telephone: (902) 809-9412; email: info@bhcontracting.ca; registered address: ____________________________; HST number: ________________</w:t>
+              <w:t>**BH Contracting Ltd.**; telephone: (902) 809-9412; email: info@bhcontracting.ca; registered address: **____________________________**; HST number: **________________**</w:t>
             </w:r>
           </w:p>
         </w:tc>
@@ -95,7 +89,7 @@
           </w:tcPr>
           <w:p>
             <w:r>
-              <w:t>Customer / Hiring Party</w:t>
+              <w:t>**Customer / Hiring Party**</w:t>
             </w:r>
           </w:p>
         </w:tc>
@@ -105,12 +99,13 @@
           </w:tcPr>
           <w:p>
             <w:r>
-              <w:t>SOI Trade Inc., attention: Walid Sallam; address: ____________________________; telephone: ________________; email: ________________</w:t>
+              <w:t>**SOI Trade Inc.**, attention: **Walid Sallam**; address: **____________________________**; telephone: **________________**; email: **________________**</w:t>
             </w:r>
           </w:p>
         </w:tc>
       </w:tr>
     </w:tbl>
+    <w:p/>
     <w:p>
       <w:r>
         <w:t>BH Contracting Ltd. is referred to as the “Contractor.” SOI Trade Inc. is referred to as the “Customer.” The Contractor and Customer are together the “Parties.”</w:t>
@@ -118,7 +113,7 @@
     </w:p>
     <w:p>
       <w:pPr>
-        <w:pStyle w:val="Heading1"/>
+        <w:pStyle w:val="Heading2"/>
       </w:pPr>
       <w:r>
         <w:t>1. Contract Documents and Order of Priority</w:t>
@@ -146,9 +141,6 @@
           </w:tcPr>
           <w:p>
             <w:r>
-              <w:rPr>
-                <w:b/>
-              </w:rPr>
               <w:t>Priority</w:t>
             </w:r>
           </w:p>
@@ -159,9 +151,6 @@
           </w:tcPr>
           <w:p>
             <w:r>
-              <w:rPr>
-                <w:b/>
-              </w:rPr>
               <w:t>Document</w:t>
             </w:r>
           </w:p>
@@ -278,6 +267,7 @@
         </w:tc>
       </w:tr>
     </w:tbl>
+    <w:p/>
     <w:p>
       <w:r>
         <w:t>If the documents conflict, the Contractor shall stop the affected work and request written direction. The BH Contracting model, renderings, takeoff, and concept elevations are not permit, structural, shop, engineering, or sealed drawings. No direction that changes cost, time, quantity, sequencing, or risk is binding unless recorded in a signed change order.</w:t>
@@ -285,7 +275,7 @@
     </w:p>
     <w:p>
       <w:pPr>
-        <w:pStyle w:val="Heading1"/>
+        <w:pStyle w:val="Heading2"/>
       </w:pPr>
       <w:r>
         <w:t>2. Scope of Work</w:t>
@@ -301,7 +291,7 @@
         <w:pStyle w:val="ListNumber"/>
       </w:pPr>
       <w:r>
-        <w:t>1. Layout and installation of approximately 30 squares (approximately 3,000 square feet) of exterior siding/cladding in a charcoal-and-cedar-tone façade pattern approved by the Customer.</w:t>
+        <w:t>Layout and installation of approximately **30 squares (approximately 3,000 square feet)** of exterior siding/cladding in a charcoal-and-cedar-tone façade pattern approved by the Customer.</w:t>
       </w:r>
     </w:p>
     <w:p>
@@ -309,7 +299,7 @@
         <w:pStyle w:val="ListNumber"/>
       </w:pPr>
       <w:r>
-        <w:t>2. Installation of associated siding trims, starter components, closures, corner treatments, and opening perimeter trims only to the extent expressly identified as Contractor-supplied or Customer-supplied in Schedule A.</w:t>
+        <w:t>Installation of associated siding trims, starter components, closures, corner treatments, and opening perimeter trims **only to the extent expressly identified as Contractor-supplied or Customer-supplied in Schedule A**.</w:t>
       </w:r>
     </w:p>
     <w:p>
@@ -317,7 +307,7 @@
         <w:pStyle w:val="ListNumber"/>
       </w:pPr>
       <w:r>
-        <w:t>3. Installation of two exterior doors at the agreed locations, including setting, plumbing, levelling, shimming, mechanical fastening, and ordinary perimeter air sealing, subject to the supplied-door and rough-opening conditions in Schedule A.</w:t>
+        <w:t>Installation of **two exterior doors** at the agreed locations, including setting, plumbing, levelling, shimming, mechanical fastening, and ordinary perimeter air sealing, subject to the supplied-door and rough-opening conditions in Schedule A.</w:t>
       </w:r>
     </w:p>
     <w:p>
@@ -325,7 +315,7 @@
         <w:pStyle w:val="ListNumber"/>
       </w:pPr>
       <w:r>
-        <w:t>4. Routine protection of the Contractor’s active work area, daily housekeeping, and removal of the Contractor’s packaging and installation debris to the designated on-site disposal location.</w:t>
+        <w:t>Routine protection of the Contractor’s active work area, daily housekeeping, and removal of the Contractor’s packaging and installation debris to the designated on-site disposal location.</w:t>
       </w:r>
     </w:p>
     <w:p>
@@ -333,15 +323,7 @@
         <w:pStyle w:val="ListNumber"/>
       </w:pPr>
       <w:r>
-        <w:t>5. Coordination with the Customer regarding opening dimensions, sequencing, access, approved layout, and substrate readiness.</w:t>
-      </w:r>
-    </w:p>
-    <w:p>
-      <w:pPr>
-        <w:pStyle w:val="ListNumber"/>
-      </w:pPr>
-      <w:r>
-        <w:t>6. One included round-trip crew fuel/travel allowance between 9A Regency Drive, Dartmouth, NS and the Project site (and back), as priced in Section 3.</w:t>
+        <w:t>Coordination with the Customer regarding opening dimensions, sequencing, access, approved layout, and substrate readiness.</w:t>
       </w:r>
     </w:p>
     <w:p>
@@ -351,7 +333,7 @@
     </w:p>
     <w:p>
       <w:pPr>
-        <w:pStyle w:val="Heading1"/>
+        <w:pStyle w:val="Heading2"/>
       </w:pPr>
       <w:r>
         <w:t>3. Contract Price</w:t>
@@ -381,9 +363,6 @@
           </w:tcPr>
           <w:p>
             <w:r>
-              <w:rPr>
-                <w:b/>
-              </w:rPr>
               <w:t>Price component</w:t>
             </w:r>
           </w:p>
@@ -394,9 +373,6 @@
           </w:tcPr>
           <w:p>
             <w:r>
-              <w:rPr>
-                <w:b/>
-              </w:rPr>
               <w:t>Quantity</w:t>
             </w:r>
           </w:p>
@@ -407,9 +383,6 @@
           </w:tcPr>
           <w:p>
             <w:r>
-              <w:rPr>
-                <w:b/>
-              </w:rPr>
               <w:t>Unit price</w:t>
             </w:r>
           </w:p>
@@ -420,9 +393,6 @@
           </w:tcPr>
           <w:p>
             <w:r>
-              <w:rPr>
-                <w:b/>
-              </w:rPr>
               <w:t>Extended price</w:t>
             </w:r>
           </w:p>
@@ -519,49 +489,7 @@
           </w:tcPr>
           <w:p>
             <w:r>
-              <w:t>Crew fuel/travel (round trip)</w:t>
-            </w:r>
-          </w:p>
-        </w:tc>
-        <w:tc>
-          <w:tcPr>
-            <w:tcW w:type="dxa" w:w="2160"/>
-          </w:tcPr>
-          <w:p>
-            <w:r>
-              <w:t>69.8 km</w:t>
-            </w:r>
-          </w:p>
-        </w:tc>
-        <w:tc>
-          <w:tcPr>
-            <w:tcW w:type="dxa" w:w="2160"/>
-          </w:tcPr>
-          <w:p>
-            <w:r>
-              <w:t>$0.72 per km (CRA rate)</w:t>
-            </w:r>
-          </w:p>
-        </w:tc>
-        <w:tc>
-          <w:tcPr>
-            <w:tcW w:type="dxa" w:w="2160"/>
-          </w:tcPr>
-          <w:p>
-            <w:r>
-              <w:t>$50.26</w:t>
-            </w:r>
-          </w:p>
-        </w:tc>
-      </w:tr>
-      <w:tr>
-        <w:tc>
-          <w:tcPr>
-            <w:tcW w:type="dxa" w:w="2160"/>
-          </w:tcPr>
-          <w:p>
-            <w:r>
-              <w:t>Contract price before HST</w:t>
+              <w:t>**Contract price before HST**</w:t>
             </w:r>
           </w:p>
         </w:tc>
@@ -587,7 +515,7 @@
           </w:tcPr>
           <w:p>
             <w:r>
-              <w:t>$13,050.26</w:t>
+              <w:t>**$13,000.00**</w:t>
             </w:r>
           </w:p>
         </w:tc>
@@ -617,7 +545,7 @@
           </w:tcPr>
           <w:p>
             <w:r>
-              <w:t>Confirm applicable treatment</w:t>
+              <w:t>**Confirm applicable treatment**</w:t>
             </w:r>
           </w:p>
         </w:tc>
@@ -627,7 +555,7 @@
           </w:tcPr>
           <w:p>
             <w:r>
-              <w:t>$________________</w:t>
+              <w:t>**$________________**</w:t>
             </w:r>
           </w:p>
         </w:tc>
@@ -639,7 +567,7 @@
           </w:tcPr>
           <w:p>
             <w:r>
-              <w:t>Total including HST</w:t>
+              <w:t>**Total including HST**</w:t>
             </w:r>
           </w:p>
         </w:tc>
@@ -665,25 +593,21 @@
           </w:tcPr>
           <w:p>
             <w:r>
-              <w:t>$________________</w:t>
+              <w:t>**$________________**</w:t>
             </w:r>
           </w:p>
         </w:tc>
       </w:tr>
     </w:tbl>
+    <w:p/>
     <w:p>
       <w:r>
-        <w:t>The crew fuel/travel line covers one round trip between 9A Regency Drive, Dartmouth, NS and the Project at 9 Alicia Scott Ave., Mount Uniacke, NS (and back), priced at the CRA reasonable automobile rate of $0.72/km for 69.8 km. Additional trips, if required, shall be billed by written change order at the same rate unless the Parties agree otherwise.</w:t>
-      </w:r>
-    </w:p>
-    <w:p>
-      <w:r>
-        <w:t>The $13,050.26 price and its tax treatment must be confirmed by both Parties before signature. The price is based on approximately 30 squares, two doors, and the included fuel/travel allowance above. Unless Schedule A expressly states otherwise, quantities materially above 30 squares, added doors/openings, redesign, concealed conditions, substrate correction, remobilization beyond the included trip, winter conditions, extraordinary access, and work outside normal installation scope are changes to the contract.</w:t>
+        <w:t>The $13,000.00 price and its tax treatment must be confirmed by both Parties before signature. The price is based on approximately 30 squares and two doors. Unless Schedule A expressly states otherwise, quantities materially above 30 squares, added doors/openings, redesign, concealed conditions, substrate correction, remobilization, winter conditions, extraordinary access, and work outside normal installation scope are changes to the contract.</w:t>
       </w:r>
     </w:p>
     <w:p>
       <w:pPr>
-        <w:pStyle w:val="Heading1"/>
+        <w:pStyle w:val="Heading2"/>
       </w:pPr>
       <w:r>
         <w:t>4. Measurement and Quantity Adjustment</w:t>
@@ -701,7 +625,7 @@
     </w:p>
     <w:p>
       <w:pPr>
-        <w:pStyle w:val="Heading1"/>
+        <w:pStyle w:val="Heading2"/>
       </w:pPr>
       <w:r>
         <w:t>5. Payment Terms and Statutory Holdback</w:t>
@@ -709,7 +633,7 @@
     </w:p>
     <w:p>
       <w:r>
-        <w:t>The Customer shall pay approved invoices according to the following gross progress schedule. Each progress payment is subject to any statutory holdback required by the Nova Scotia Builders’ Lien Act.</w:t>
+        <w:t>The Customer shall pay approved invoices according to the following gross progress schedule. Each progress payment is subject to any statutory holdback required by the Nova Scotia *Builders’ Lien Act*.</w:t>
       </w:r>
     </w:p>
     <w:tbl>
@@ -729,9 +653,6 @@
           </w:tcPr>
           <w:p>
             <w:r>
-              <w:rPr>
-                <w:b/>
-              </w:rPr>
               <w:t>Milestone</w:t>
             </w:r>
           </w:p>
@@ -742,9 +663,6 @@
           </w:tcPr>
           <w:p>
             <w:r>
-              <w:rPr>
-                <w:b/>
-              </w:rPr>
               <w:t>Gross amount before holdback and HST</w:t>
             </w:r>
           </w:p>
@@ -757,7 +675,7 @@
           </w:tcPr>
           <w:p>
             <w:r>
-              <w:t>Mobilization, approved layout, commencement, and included fuel/travel</w:t>
+              <w:t>Mobilization, approved layout, and commencement of installation</w:t>
             </w:r>
           </w:p>
         </w:tc>
@@ -767,7 +685,7 @@
           </w:tcPr>
           <w:p>
             <w:r>
-              <w:t>$3,300.26</w:t>
+              <w:t>$3,250.00</w:t>
             </w:r>
           </w:p>
         </w:tc>
@@ -823,7 +741,7 @@
           </w:tcPr>
           <w:p>
             <w:r>
-              <w:t>Total contract price before HST</w:t>
+              <w:t>**Total contract price before HST**</w:t>
             </w:r>
           </w:p>
         </w:tc>
@@ -833,15 +751,16 @@
           </w:tcPr>
           <w:p>
             <w:r>
-              <w:t>$13,050.26</w:t>
+              <w:t>**$13,000.00**</w:t>
             </w:r>
           </w:p>
         </w:tc>
       </w:tr>
     </w:tbl>
+    <w:p/>
     <w:p>
       <w:r>
-        <w:t>The payer shall retain 10% of the value of work, services, and materials actually supplied for the statutory period. Under section 13 of the Nova Scotia Builders’ Lien Act, the holdback is generally retained for 60 days after substantial performance, subject to the Act’s conditions, lien notices, remaining work, and release rules.[1] On the $13,050.26 pre-HST price, the full contract holdback would be $1,305.03 if the entire price is lienable and no adjustment applies.</w:t>
+        <w:t>The payer shall retain 10% of the value of work, services, and materials actually supplied for the statutory period. Under section 13 of the Nova Scotia *Builders’ Lien Act*, the holdback is generally retained for 60 days after substantial performance, subject to the Act’s conditions, lien notices, remaining work, and release rules.[1] On the $13,000.00 pre-HST price, the full contract holdback would be $1,300.00 if the entire price is lienable and no adjustment applies.</w:t>
       </w:r>
     </w:p>
     <w:p>
@@ -851,7 +770,7 @@
     </w:p>
     <w:p>
       <w:pPr>
-        <w:pStyle w:val="Heading1"/>
+        <w:pStyle w:val="Heading2"/>
       </w:pPr>
       <w:r>
         <w:t>6. Schedule</w:t>
@@ -869,7 +788,7 @@
     </w:p>
     <w:p>
       <w:pPr>
-        <w:pStyle w:val="Heading1"/>
+        <w:pStyle w:val="Heading2"/>
       </w:pPr>
       <w:r>
         <w:t>7. Customer Responsibilities</w:t>
@@ -885,7 +804,7 @@
         <w:pStyle w:val="ListNumber"/>
       </w:pPr>
       <w:r>
-        <w:t>1. Provide lawful and safe access to the Project, work faces, washroom facilities, electrical power, water where reasonably required, and a designated area for material staging and waste.</w:t>
+        <w:t>Provide lawful and safe access to the Project, work faces, washroom facilities, electrical power, water where reasonably required, and a designated area for material staging and waste.</w:t>
       </w:r>
     </w:p>
     <w:p>
@@ -893,7 +812,7 @@
         <w:pStyle w:val="ListNumber"/>
       </w:pPr>
       <w:r>
-        <w:t>2. Provide the latest authorized drawings, permits, approvals, surveys, shop drawings, product data, finish selections, and written coordination information affecting the Contractor’s work.</w:t>
+        <w:t>Provide the latest authorized drawings, permits, approvals, surveys, shop drawings, product data, finish selections, and written coordination information affecting the Contractor’s work.</w:t>
       </w:r>
     </w:p>
     <w:p>
@@ -901,7 +820,7 @@
         <w:pStyle w:val="ListNumber"/>
       </w:pPr>
       <w:r>
-        <w:t>3. Ensure the wall substrate, sheathing, air/water barrier, membranes, insulation, furring, blocking, flashings, roof/eave transitions, penetrations, and rough openings are complete, sound, dry, plumb, level, properly integrated, and ready to receive the Contractor’s work, except for items expressly included in Schedule A.</w:t>
+        <w:t>Ensure the wall substrate, sheathing, air/water barrier, membranes, insulation, furring, blocking, flashings, roof/eave transitions, penetrations, and rough openings are complete, sound, dry, plumb, level, properly integrated, and ready to receive the Contractor’s work, except for items expressly included in Schedule A.</w:t>
       </w:r>
     </w:p>
     <w:p>
@@ -909,7 +828,7 @@
         <w:pStyle w:val="ListNumber"/>
       </w:pPr>
       <w:r>
-        <w:t>4. Confirm the legal identity of the owner, constructor/general contractor, Customer, consultant, and party authorized to direct and approve changes.</w:t>
+        <w:t>Confirm the legal identity of the owner, constructor/general contractor, Customer, consultant, and party authorized to direct and approve changes.</w:t>
       </w:r>
     </w:p>
     <w:p>
@@ -917,7 +836,7 @@
         <w:pStyle w:val="ListNumber"/>
       </w:pPr>
       <w:r>
-        <w:t>5. Arrange uninterrupted access to the work and coordinate other trades so they do not damage, cover, remove, or obstruct the Contractor’s work.</w:t>
+        <w:t>Arrange uninterrupted access to the work and coordinate other trades so they do not damage, cover, remove, or obstruct the Contractor’s work.</w:t>
       </w:r>
     </w:p>
     <w:p>
@@ -925,7 +844,7 @@
         <w:pStyle w:val="ListNumber"/>
       </w:pPr>
       <w:r>
-        <w:t>6. Verify that Customer-supplied materials are correct, undamaged, compatible, code-compliant, complete, delivered on time, and sufficient for the work, including reasonable waste and replacements.</w:t>
+        <w:t>Verify that Customer-supplied materials are correct, undamaged, compatible, code-compliant, complete, delivered on time, and sufficient for the work, including reasonable waste and replacements.</w:t>
       </w:r>
     </w:p>
     <w:p>
@@ -933,12 +852,12 @@
         <w:pStyle w:val="ListNumber"/>
       </w:pPr>
       <w:r>
-        <w:t>7. Provide written approval of the façade layout, material colours, transition heights, trim approach, and door locations before installation.</w:t>
+        <w:t>Provide written approval of the façade layout, material colours, transition heights, trim approach, and door locations before installation.</w:t>
       </w:r>
     </w:p>
     <w:p>
       <w:pPr>
-        <w:pStyle w:val="Heading1"/>
+        <w:pStyle w:val="Heading2"/>
       </w:pPr>
       <w:r>
         <w:t>8. Contractor Responsibilities</w:t>
@@ -954,7 +873,7 @@
         <w:pStyle w:val="ListNumber"/>
       </w:pPr>
       <w:r>
-        <w:t>1. Supervise and coordinate its own personnel and subcontractors.</w:t>
+        <w:t>Supervise and coordinate its own personnel and subcontractors.</w:t>
       </w:r>
     </w:p>
     <w:p>
@@ -962,7 +881,7 @@
         <w:pStyle w:val="ListNumber"/>
       </w:pPr>
       <w:r>
-        <w:t>2. Follow applicable occupational-health-and-safety requirements and take every precaution reasonably required within the Contractor’s authority and control. Nova Scotia’s framework assigns duties to owners, constructors, contractors, employers, and workers according to their roles and degree of control; this agreement does not transfer a statutory duty contrary to law.[2]</w:t>
+        <w:t>Follow applicable occupational-health-and-safety requirements and take every precaution reasonably required within the Contractor’s authority and control. Nova Scotia’s framework assigns duties to owners, constructors, contractors, employers, and workers according to their roles and degree of control; this agreement does not transfer a statutory duty contrary to law.[2]</w:t>
       </w:r>
     </w:p>
     <w:p>
@@ -970,7 +889,7 @@
         <w:pStyle w:val="ListNumber"/>
       </w:pPr>
       <w:r>
-        <w:t>3. Promptly report discovered conditions that materially conflict with the contract documents, safe installation, or manufacturer requirements.</w:t>
+        <w:t>Promptly report discovered conditions that materially conflict with the contract documents, safe installation, or manufacturer requirements.</w:t>
       </w:r>
     </w:p>
     <w:p>
@@ -978,7 +897,7 @@
         <w:pStyle w:val="ListNumber"/>
       </w:pPr>
       <w:r>
-        <w:t>4. Protect its work until the Customer takes possession or another trade assumes control of the affected area, whichever occurs first.</w:t>
+        <w:t>Protect its work until the Customer takes possession or another trade assumes control of the affected area, whichever occurs first.</w:t>
       </w:r>
     </w:p>
     <w:p>
@@ -986,12 +905,12 @@
         <w:pStyle w:val="ListNumber"/>
       </w:pPr>
       <w:r>
-        <w:t>5. Maintain records reasonably supporting progress invoices, approved extras, and substantial performance.</w:t>
+        <w:t>Maintain records reasonably supporting progress invoices, approved extras, and substantial performance.</w:t>
       </w:r>
     </w:p>
     <w:p>
       <w:pPr>
-        <w:pStyle w:val="Heading1"/>
+        <w:pStyle w:val="Heading2"/>
       </w:pPr>
       <w:r>
         <w:t>9. WCB, Insurance, and Compliance</w:t>
@@ -1009,7 +928,7 @@
     </w:p>
     <w:p>
       <w:pPr>
-        <w:pStyle w:val="Heading1"/>
+        <w:pStyle w:val="Heading2"/>
       </w:pPr>
       <w:r>
         <w:t>10. Changes and Extra Work</w:t>
@@ -1027,7 +946,7 @@
     </w:p>
     <w:p>
       <w:pPr>
-        <w:pStyle w:val="Heading1"/>
+        <w:pStyle w:val="Heading2"/>
       </w:pPr>
       <w:r>
         <w:t>11. Site Conditions and Substrate</w:t>
@@ -1045,7 +964,7 @@
     </w:p>
     <w:p>
       <w:pPr>
-        <w:pStyle w:val="Heading1"/>
+        <w:pStyle w:val="Heading2"/>
       </w:pPr>
       <w:r>
         <w:t>12. Materials, Title, and Risk</w:t>
@@ -1063,7 +982,7 @@
     </w:p>
     <w:p>
       <w:pPr>
-        <w:pStyle w:val="Heading1"/>
+        <w:pStyle w:val="Heading2"/>
       </w:pPr>
       <w:r>
         <w:t>13. Inspection, Deficiencies, and Substantial Performance</w:t>
@@ -1081,7 +1000,7 @@
     </w:p>
     <w:p>
       <w:pPr>
-        <w:pStyle w:val="Heading1"/>
+        <w:pStyle w:val="Heading2"/>
       </w:pPr>
       <w:r>
         <w:t>14. Workmanship Warranty</w:t>
@@ -1099,7 +1018,7 @@
     </w:p>
     <w:p>
       <w:pPr>
-        <w:pStyle w:val="Heading1"/>
+        <w:pStyle w:val="Heading2"/>
       </w:pPr>
       <w:r>
         <w:t>15. Suspension and Termination</w:t>
@@ -1117,7 +1036,7 @@
     </w:p>
     <w:p>
       <w:pPr>
-        <w:pStyle w:val="Heading1"/>
+        <w:pStyle w:val="Heading2"/>
       </w:pPr>
       <w:r>
         <w:t>16. Indemnity and Limitation</w:t>
@@ -1135,7 +1054,7 @@
     </w:p>
     <w:p>
       <w:pPr>
-        <w:pStyle w:val="Heading1"/>
+        <w:pStyle w:val="Heading2"/>
       </w:pPr>
       <w:r>
         <w:t>17. Dispute Resolution</w:t>
@@ -1153,7 +1072,7 @@
     </w:p>
     <w:p>
       <w:pPr>
-        <w:pStyle w:val="Heading1"/>
+        <w:pStyle w:val="Heading2"/>
       </w:pPr>
       <w:r>
         <w:t>18. Notices</w:t>
@@ -1166,7 +1085,7 @@
     </w:p>
     <w:p>
       <w:pPr>
-        <w:pStyle w:val="Heading1"/>
+        <w:pStyle w:val="Heading2"/>
       </w:pPr>
       <w:r>
         <w:t>19. General Terms</w:t>
@@ -1184,7 +1103,7 @@
     </w:p>
     <w:p>
       <w:pPr>
-        <w:pStyle w:val="Heading1"/>
+        <w:pStyle w:val="Heading2"/>
       </w:pPr>
       <w:r>
         <w:t>20. Signatures</w:t>
@@ -1212,9 +1131,6 @@
           </w:tcPr>
           <w:p>
             <w:r>
-              <w:rPr>
-                <w:b/>
-              </w:rPr>
               <w:t>For BH Contracting Ltd.</w:t>
             </w:r>
           </w:p>
@@ -1225,9 +1141,6 @@
           </w:tcPr>
           <w:p>
             <w:r>
-              <w:rPr>
-                <w:b/>
-              </w:rPr>
               <w:t>For SOI Trade Inc.</w:t>
             </w:r>
           </w:p>
@@ -1240,7 +1153,7 @@
           </w:tcPr>
           <w:p>
             <w:r>
-              <w:t>Name: ____________________________</w:t>
+              <w:t>Name: **____________________________**</w:t>
             </w:r>
           </w:p>
         </w:tc>
@@ -1250,7 +1163,7 @@
           </w:tcPr>
           <w:p>
             <w:r>
-              <w:t>Name: Walid Sallam / ____________________________</w:t>
+              <w:t>Name: **Walid Sallam / ____________________________**</w:t>
             </w:r>
           </w:p>
         </w:tc>
@@ -1262,7 +1175,7 @@
           </w:tcPr>
           <w:p>
             <w:r>
-              <w:t>Title: ____________________________</w:t>
+              <w:t>Title: **____________________________**</w:t>
             </w:r>
           </w:p>
         </w:tc>
@@ -1272,7 +1185,7 @@
           </w:tcPr>
           <w:p>
             <w:r>
-              <w:t>Title: ____________________________</w:t>
+              <w:t>Title: **____________________________**</w:t>
             </w:r>
           </w:p>
         </w:tc>
@@ -1284,7 +1197,7 @@
           </w:tcPr>
           <w:p>
             <w:r>
-              <w:t>Signature: _________________________</w:t>
+              <w:t>Signature: **_________________________**</w:t>
             </w:r>
           </w:p>
         </w:tc>
@@ -1294,7 +1207,7 @@
           </w:tcPr>
           <w:p>
             <w:r>
-              <w:t>Signature: _________________________</w:t>
+              <w:t>Signature: **_________________________**</w:t>
             </w:r>
           </w:p>
         </w:tc>
@@ -1306,7 +1219,7 @@
           </w:tcPr>
           <w:p>
             <w:r>
-              <w:t>Date: _____________________________</w:t>
+              <w:t>Date: **_____________________________**</w:t>
             </w:r>
           </w:p>
         </w:tc>
@@ -1316,15 +1229,16 @@
           </w:tcPr>
           <w:p>
             <w:r>
-              <w:t>Date: _____________________________</w:t>
+              <w:t>Date: **_____________________________**</w:t>
             </w:r>
           </w:p>
         </w:tc>
       </w:tr>
     </w:tbl>
+    <w:p/>
     <w:p>
       <w:pPr>
-        <w:pStyle w:val="Title"/>
+        <w:pStyle w:val="Heading1"/>
       </w:pPr>
       <w:r>
         <w:t>Schedule A — Detailed Scope and Responsibility Matrix</w:t>
@@ -1355,9 +1269,6 @@
           </w:tcPr>
           <w:p>
             <w:r>
-              <w:rPr>
-                <w:b/>
-              </w:rPr>
               <w:t>Item</w:t>
             </w:r>
           </w:p>
@@ -1368,9 +1279,6 @@
           </w:tcPr>
           <w:p>
             <w:r>
-              <w:rPr>
-                <w:b/>
-              </w:rPr>
               <w:t>Included by BH</w:t>
             </w:r>
           </w:p>
@@ -1381,9 +1289,6 @@
           </w:tcPr>
           <w:p>
             <w:r>
-              <w:rPr>
-                <w:b/>
-              </w:rPr>
               <w:t>Customer-supplied / by others</w:t>
             </w:r>
           </w:p>
@@ -1394,9 +1299,6 @@
           </w:tcPr>
           <w:p>
             <w:r>
-              <w:rPr>
-                <w:b/>
-              </w:rPr>
               <w:t>Excluded</w:t>
             </w:r>
           </w:p>
@@ -1407,9 +1309,6 @@
           </w:tcPr>
           <w:p>
             <w:r>
-              <w:rPr>
-                <w:b/>
-              </w:rPr>
               <w:t>Clarification</w:t>
             </w:r>
           </w:p>
@@ -2176,58 +2075,6 @@
           </w:tcPr>
           <w:p>
             <w:r>
-              <w:t>Crew vehicle fuel/travel (Dartmouth ↔ site RT)</w:t>
-            </w:r>
-          </w:p>
-        </w:tc>
-        <w:tc>
-          <w:tcPr>
-            <w:tcW w:type="dxa" w:w="1728"/>
-          </w:tcPr>
-          <w:p>
-            <w:r>
-              <w:t>☒</w:t>
-            </w:r>
-          </w:p>
-        </w:tc>
-        <w:tc>
-          <w:tcPr>
-            <w:tcW w:type="dxa" w:w="1728"/>
-          </w:tcPr>
-          <w:p>
-            <w:r>
-              <w:t>☐</w:t>
-            </w:r>
-          </w:p>
-        </w:tc>
-        <w:tc>
-          <w:tcPr>
-            <w:tcW w:type="dxa" w:w="1728"/>
-          </w:tcPr>
-          <w:p>
-            <w:r>
-              <w:t>☐</w:t>
-            </w:r>
-          </w:p>
-        </w:tc>
-        <w:tc>
-          <w:tcPr>
-            <w:tcW w:type="dxa" w:w="1728"/>
-          </w:tcPr>
-          <w:p>
-            <w:r>
-              <w:t>$50.26 included; 9A Regency Drive ↔ Mount Uniacke @ $0.72/km</w:t>
-            </w:r>
-          </w:p>
-        </w:tc>
-      </w:tr>
-      <w:tr>
-        <w:tc>
-          <w:tcPr>
-            <w:tcW w:type="dxa" w:w="1728"/>
-          </w:tcPr>
-          <w:p>
-            <w:r>
               <w:t>Fall-protection anchor provisions</w:t>
             </w:r>
           </w:p>
@@ -2630,9 +2477,10 @@
         </w:tc>
       </w:tr>
     </w:tbl>
+    <w:p/>
     <w:p>
       <w:pPr>
-        <w:pStyle w:val="Heading2"/>
+        <w:pStyle w:val="Heading3"/>
       </w:pPr>
       <w:r>
         <w:t>Approved Façade Layout</w:t>
@@ -2655,9 +2503,6 @@
           </w:tcPr>
           <w:p>
             <w:r>
-              <w:rPr>
-                <w:b/>
-              </w:rPr>
               <w:t>Decision</w:t>
             </w:r>
           </w:p>
@@ -2668,9 +2513,6 @@
           </w:tcPr>
           <w:p>
             <w:r>
-              <w:rPr>
-                <w:b/>
-              </w:rPr>
               <w:t>Approved selection</w:t>
             </w:r>
           </w:p>
@@ -2853,9 +2695,10 @@
         </w:tc>
       </w:tr>
     </w:tbl>
+    <w:p/>
     <w:p>
       <w:pPr>
-        <w:pStyle w:val="Title"/>
+        <w:pStyle w:val="Heading1"/>
       </w:pPr>
       <w:r>
         <w:t>Schedule B — Project Administration</w:t>
@@ -2878,9 +2721,6 @@
           </w:tcPr>
           <w:p>
             <w:r>
-              <w:rPr>
-                <w:b/>
-              </w:rPr>
               <w:t>Item</w:t>
             </w:r>
           </w:p>
@@ -2891,9 +2731,6 @@
           </w:tcPr>
           <w:p>
             <w:r>
-              <w:rPr>
-                <w:b/>
-              </w:rPr>
               <w:t>Agreed information</w:t>
             </w:r>
           </w:p>
@@ -3230,9 +3067,10 @@
         </w:tc>
       </w:tr>
     </w:tbl>
+    <w:p/>
     <w:p>
       <w:pPr>
-        <w:pStyle w:val="Title"/>
+        <w:pStyle w:val="Heading1"/>
       </w:pPr>
       <w:r>
         <w:t>References</w:t>

</xml_diff>

<commit_message>
fix(walid): scrub Manus/AI refs and restore 3+1 week fuel pricing
Customer-facing clean package and docs no longer mention Manus/AI/draft
banners. Contract and presentation totals include 20 crew RTs for a
3-week job plus 1-week pushback ($1,005.12; $14,005.12 before HST).

Co-authored-by: Joel <GemsNS@users.noreply.github.com>
</commit_message>
<xml_diff>
--- a/presentations/walid/clean/project-assets/Walid_Siding_Contract.docx
+++ b/presentations/walid/clean/project-assets/Walid_Siding_Contract.docx
@@ -515,7 +515,7 @@
           </w:tcPr>
           <w:p>
             <w:r>
-              <w:t>**$13,000.00**</w:t>
+              <w:t>**$14,005.12**</w:t>
             </w:r>
           </w:p>
         </w:tc>
@@ -602,7 +602,7 @@
     <w:p/>
     <w:p>
       <w:r>
-        <w:t>The $13,000.00 price and its tax treatment must be confirmed by both Parties before signature. The price is based on approximately 30 squares and two doors. Unless Schedule A expressly states otherwise, quantities materially above 30 squares, added doors/openings, redesign, concealed conditions, substrate correction, remobilization, winter conditions, extraordinary access, and work outside normal installation scope are changes to the contract.</w:t>
+        <w:t>The crew fuel/travel allowance covers 20 included round trips (3-week job + 1-week pushback; 1,396.0 km @ $0.72/km = $1,005.12) between 9A Regency Drive, Dartmouth, NS and the Project site. The $14,005.12 price and its tax treatment must be confirmed by both Parties before signature. The price is based on approximately 30 squares and two doors. Unless Schedule A expressly states otherwise, quantities materially above 30 squares, added doors/openings, redesign, concealed conditions, substrate correction, remobilization, winter conditions, extraordinary access, and work outside normal installation scope are changes to the contract.</w:t>
       </w:r>
     </w:p>
     <w:p>
@@ -751,7 +751,7 @@
           </w:tcPr>
           <w:p>
             <w:r>
-              <w:t>**$13,000.00**</w:t>
+              <w:t>**$14,005.12**</w:t>
             </w:r>
           </w:p>
         </w:tc>
@@ -760,7 +760,7 @@
     <w:p/>
     <w:p>
       <w:r>
-        <w:t>The payer shall retain 10% of the value of work, services, and materials actually supplied for the statutory period. Under section 13 of the Nova Scotia *Builders’ Lien Act*, the holdback is generally retained for 60 days after substantial performance, subject to the Act’s conditions, lien notices, remaining work, and release rules.[1] On the $13,000.00 pre-HST price, the full contract holdback would be $1,300.00 if the entire price is lienable and no adjustment applies.</w:t>
+        <w:t>The payer shall retain 10% of the value of work, services, and materials actually supplied for the statutory period. Under section 13 of the Nova Scotia *Builders’ Lien Act*, the holdback is generally retained for 60 days after substantial performance, subject to the Act’s conditions, lien notices, remaining work, and release rules.[1] On the $14,005.12 pre-HST price, the full contract holdback would be $1,400.51 if the entire price is lienable and no adjustment applies.</w:t>
       </w:r>
     </w:p>
     <w:p>

</xml_diff>

<commit_message>
fix(crm): waive Walid $1,005.12 fuel/travel charge
Customer agreed there is no fuel charge. Contract value is now
$13,000 pre-HST (siding + doors only); milestones drop the fuel
portion from mobilization.

Co-authored-by: Joel <GemsNS@users.noreply.github.com>
</commit_message>
<xml_diff>
--- a/presentations/walid/clean/project-assets/Walid_Siding_Contract.docx
+++ b/presentations/walid/clean/project-assets/Walid_Siding_Contract.docx
@@ -515,7 +515,7 @@
           </w:tcPr>
           <w:p>
             <w:r>
-              <w:t>**$14,005.12**</w:t>
+              <w:t>**$13,000.00**</w:t>
             </w:r>
           </w:p>
         </w:tc>
@@ -602,7 +602,7 @@
     <w:p/>
     <w:p>
       <w:r>
-        <w:t>The crew fuel/travel allowance covers 20 included round trips (3-week job + 1-week pushback; 1,396.0 km @ $0.72/km = $1,005.12) between 9A Regency Drive, Dartmouth, NS and the Project site. The $14,005.12 price and its tax treatment must be confirmed by both Parties before signature. The price is based on approximately 30 squares and two doors. Unless Schedule A expressly states otherwise, quantities materially above 30 squares, added doors/openings, redesign, concealed conditions, substrate correction, remobilization, winter conditions, extraordinary access, and work outside normal installation scope are changes to the contract.</w:t>
+        <w:t>The crew fuel/travel allowance covers 20 included round trips (3-week job + 1-week pushback; 1,396.0 km @ $0.72/km = $0.00) between 9A Regency Drive, Dartmouth, NS and the Project site. The $13,000.00 price and its tax treatment must be confirmed by both Parties before signature. The price is based on approximately 30 squares and two doors. Unless Schedule A expressly states otherwise, quantities materially above 30 squares, added doors/openings, redesign, concealed conditions, substrate correction, remobilization, winter conditions, extraordinary access, and work outside normal installation scope are changes to the contract.</w:t>
       </w:r>
     </w:p>
     <w:p>
@@ -751,7 +751,7 @@
           </w:tcPr>
           <w:p>
             <w:r>
-              <w:t>**$14,005.12**</w:t>
+              <w:t>**$13,000.00**</w:t>
             </w:r>
           </w:p>
         </w:tc>
@@ -760,7 +760,7 @@
     <w:p/>
     <w:p>
       <w:r>
-        <w:t>The payer shall retain 10% of the value of work, services, and materials actually supplied for the statutory period. Under section 13 of the Nova Scotia *Builders’ Lien Act*, the holdback is generally retained for 60 days after substantial performance, subject to the Act’s conditions, lien notices, remaining work, and release rules.[1] On the $14,005.12 pre-HST price, the full contract holdback would be $1,400.51 if the entire price is lienable and no adjustment applies.</w:t>
+        <w:t>The payer shall retain 10% of the value of work, services, and materials actually supplied for the statutory period. Under section 13 of the Nova Scotia *Builders’ Lien Act*, the holdback is generally retained for 60 days after substantial performance, subject to the Act’s conditions, lien notices, remaining work, and release rules.[1] On the $13,000.00 pre-HST price, the full contract holdback would be $1,300.00 if the entire price is lienable and no adjustment applies.</w:t>
       </w:r>
     </w:p>
     <w:p>

</xml_diff>